<commit_message>
Ajuste em tela de cid
</commit_message>
<xml_diff>
--- a/plennuscApp/public/uploadgestao/docs/youBut/aditivo_uniao_medica.docx
+++ b/plennuscApp/public/uploadgestao/docs/youBut/aditivo_uniao_medica.docx
@@ -195,7 +195,16 @@
         <w:jc w:val="both"/>
       </w:pPr>
       <w:r>
-        <w:t>As demais condições aplicáveis ao produto contratado permanecerão de acordo com as regras e condições estabelecidas pela operadora.</w:t>
+        <w:t xml:space="preserve">As demais condições aplicáveis ao produto contratado permanecerão de acordo com as regras e </w:t>
+      </w:r>
+      <w:r>
+        <w:rPr>
+          <w:u w:val="single"/>
+        </w:rPr>
+        <w:t>condições</w:t>
+      </w:r>
+      <w:r>
+        <w:t xml:space="preserve"> estabelecidas pela operadora.</w:t>
       </w:r>
     </w:p>
     <w:p>
@@ -224,75 +233,7 @@
         <w:t>Por estar ciente e de acordo com a alteração descrita neste documento, firmo o presente termo para que produza seus devidos efeitos.</w:t>
       </w:r>
     </w:p>
-    <w:p>
-      <w:pPr>
-        <w:rPr>
-          <w:b/>
-          <w:bCs/>
-        </w:rPr>
-      </w:pPr>
-      <w:r>
-        <w:rPr>
-          <w:b/>
-          <w:bCs/>
-        </w:rPr>
-        <w:t>Local e data:</w:t>
-      </w:r>
-    </w:p>
-    <w:p>
-      <w:pPr>
-        <w:rPr>
-          <w:b/>
-          <w:bCs/>
-        </w:rPr>
-      </w:pPr>
-    </w:p>
-    <w:p>
-      <w:r>
-        <w:t xml:space="preserve"> ______________________________________________________</w:t>
-      </w:r>
-      <w:r>
-        <w:t>______________________</w:t>
-      </w:r>
-    </w:p>
-    <w:p>
-      <w:pPr>
-        <w:rPr>
-          <w:b/>
-          <w:bCs/>
-        </w:rPr>
-      </w:pPr>
-      <w:r>
-        <w:rPr>
-          <w:b/>
-          <w:bCs/>
-        </w:rPr>
-        <w:t>Titular/Responsável Financeiro</w:t>
-      </w:r>
-      <w:r>
-        <w:rPr>
-          <w:b/>
-          <w:bCs/>
-        </w:rPr>
-        <w:t xml:space="preserve">: </w:t>
-      </w:r>
-    </w:p>
-    <w:p>
-      <w:pPr>
-        <w:rPr>
-          <w:b/>
-          <w:bCs/>
-        </w:rPr>
-      </w:pPr>
-    </w:p>
-    <w:p>
-      <w:r>
-        <w:t>______________________________________________________</w:t>
-      </w:r>
-      <w:r>
-        <w:t>_______________________</w:t>
-      </w:r>
-    </w:p>
+    <w:p/>
     <w:sectPr>
       <w:pgSz w:w="11906" w:h="16838"/>
       <w:pgMar w:top="1417" w:right="1701" w:bottom="1417" w:left="1701" w:header="708" w:footer="708" w:gutter="0"/>

</xml_diff>